<commit_message>
feat: PWM clean frequency target + dual MQTT + web dashboard
- PWM.c: s_desired_freq clean target, PWM_AdjustFreq_Up/Down eliminate
  integer truncation error accumulation (each +1kHz is exact)
- App_Net.c: telemetry 2000ms→500ms, SS_IDLE/FAULT force V=0/I=0,
  CMD:F_UP/DOWN use new PWM_AdjustFreq functions
- ESP8266 firmware: dual MQTT (OneNET+EMQX public broker),
  FreqAdd/FreqSub virtual buttons, set_reply, WiFiManager v2.x fix,
  subscribe-after-connect pattern for public broker cmd topic
- Web dashboard (APP/): Vite+React+TS+Tailwind, EMQX WebSocket,
  cmdLock pattern prevents state inference race conditions,
  Math.floor for frequency display matching OLED
- UI.c: KEY1 uses PWM_AdjustFreq_Up, simplified from inline calc
- PWM.h: fix stale 20ms→10ms soft-start comment
- Docs: V4.2, CLAUDE.md refreshed with new module APIs
</commit_message>
<xml_diff>
--- a/Claude_Files/docs/软件架构与开发者指南.docx
+++ b/Claude_Files/docs/软件架构与开发者指南.docx
@@ -288,7 +288,7 @@
                 <w:sz w:val="20"/>
                 <w:szCs w:val="20"/>
               </w:rPr>
-              <w:t xml:space="preserve">V4.1</w:t>
+              <w:t xml:space="preserve">V4.2</w:t>
             </w:r>
           </w:p>
         </w:tc>
@@ -416,7 +416,7 @@
                 <w:sz w:val="20"/>
                 <w:szCs w:val="20"/>
               </w:rPr>
-              <w:t xml:space="preserve">V4.1</w:t>
+              <w:t xml:space="preserve">V4.2</w:t>
             </w:r>
           </w:p>
         </w:tc>
@@ -615,6 +615,101 @@
                 <w:szCs w:val="20"/>
               </w:rPr>
               <w:t xml:space="preserve">变更说明</w:t>
+            </w:r>
+          </w:p>
+        </w:tc>
+      </w:tr>
+      <w:tr>
+        <w:tc>
+          <w:tcPr>
+            <w:tcW w:type="dxa" w:w="3024"/>
+            <w:tcBorders>
+              <w:top w:val="single" w:color="CCCCCC" w:sz="1"/>
+              <w:left w:val="single" w:color="CCCCCC" w:sz="1"/>
+              <w:bottom w:val="single" w:color="CCCCCC" w:sz="1"/>
+              <w:right w:val="single" w:color="CCCCCC" w:sz="1"/>
+            </w:tcBorders>
+            <w:tcMar>
+              <w:top w:type="dxa" w:w="60"/>
+              <w:left w:type="dxa" w:w="100"/>
+              <w:bottom w:type="dxa" w:w="60"/>
+              <w:right w:type="dxa" w:w="100"/>
+            </w:tcMar>
+          </w:tcPr>
+          <w:p>
+            <w:pPr>
+              <w:spacing w:line="288"/>
+            </w:pPr>
+            <w:r>
+              <w:rPr>
+                <w:rFonts w:ascii="SimSun" w:cs="SimSun" w:eastAsia="SimSun" w:hAnsi="SimSun"/>
+                <w:color w:val="333333"/>
+                <w:sz w:val="20"/>
+                <w:szCs w:val="20"/>
+              </w:rPr>
+              <w:t xml:space="preserve">V4.2</w:t>
+            </w:r>
+          </w:p>
+        </w:tc>
+        <w:tc>
+          <w:tcPr>
+            <w:tcW w:type="dxa" w:w="3024"/>
+            <w:tcBorders>
+              <w:top w:val="single" w:color="CCCCCC" w:sz="1"/>
+              <w:left w:val="single" w:color="CCCCCC" w:sz="1"/>
+              <w:bottom w:val="single" w:color="CCCCCC" w:sz="1"/>
+              <w:right w:val="single" w:color="CCCCCC" w:sz="1"/>
+            </w:tcBorders>
+            <w:tcMar>
+              <w:top w:type="dxa" w:w="60"/>
+              <w:left w:type="dxa" w:w="100"/>
+              <w:bottom w:type="dxa" w:w="60"/>
+              <w:right w:type="dxa" w:w="100"/>
+            </w:tcMar>
+          </w:tcPr>
+          <w:p>
+            <w:pPr>
+              <w:spacing w:line="288"/>
+            </w:pPr>
+            <w:r>
+              <w:rPr>
+                <w:rFonts w:ascii="SimSun" w:cs="SimSun" w:eastAsia="SimSun" w:hAnsi="SimSun"/>
+                <w:color w:val="333333"/>
+                <w:sz w:val="20"/>
+                <w:szCs w:val="20"/>
+              </w:rPr>
+              <w:t xml:space="preserve">2026-05-22</w:t>
+            </w:r>
+          </w:p>
+        </w:tc>
+        <w:tc>
+          <w:tcPr>
+            <w:tcW w:type="dxa" w:w="3024"/>
+            <w:tcBorders>
+              <w:top w:val="single" w:color="CCCCCC" w:sz="1"/>
+              <w:left w:val="single" w:color="CCCCCC" w:sz="1"/>
+              <w:bottom w:val="single" w:color="CCCCCC" w:sz="1"/>
+              <w:right w:val="single" w:color="CCCCCC" w:sz="1"/>
+            </w:tcBorders>
+            <w:tcMar>
+              <w:top w:type="dxa" w:w="60"/>
+              <w:left w:type="dxa" w:w="100"/>
+              <w:bottom w:type="dxa" w:w="60"/>
+              <w:right w:type="dxa" w:w="100"/>
+            </w:tcMar>
+          </w:tcPr>
+          <w:p>
+            <w:pPr>
+              <w:spacing w:line="288"/>
+            </w:pPr>
+            <w:r>
+              <w:rPr>
+                <w:rFonts w:ascii="SimSun" w:cs="SimSun" w:eastAsia="SimSun" w:hAnsi="SimSun"/>
+                <w:color w:val="333333"/>
+                <w:sz w:val="20"/>
+                <w:szCs w:val="20"/>
+              </w:rPr>
+              <w:t xml:space="preserve">PWM_AdjustFreq_Up/Down 干净目标频率消除累积误差; 遥测周期2000ms→500ms; SS_IDLE/FAULT强制V=0; ESP8266双MQTT(OneNET+EMQX); Web监控面板(APP/); 移除React StrictMode</w:t>
             </w:r>
           </w:p>
         </w:tc>

</xml_diff>

<commit_message>
chore: unify project versioning to V0.0.0 (Vx.y.z scheme, x=0 fixed)
- Set current version to V0.0.0 in CLAUDE.md, README.md badge + table
- Add version numbering rules chapter to CLAUDE.md with historical mapping
- Update @brief/@note version comments in main.c and UI.c to V0.0.0
- Update skill doc version examples from V1.x to V0.x.x scheme
- Regenerate .docx for the architecture guide
- Historical mapping: V1.0→V0.0.0, V1.1→V0.0.1
</commit_message>
<xml_diff>
--- a/Claude_Files/docs/软件架构与开发者指南.docx
+++ b/Claude_Files/docs/软件架构与开发者指南.docx
@@ -288,7 +288,7 @@
                 <w:sz w:val="20"/>
                 <w:szCs w:val="20"/>
               </w:rPr>
-              <w:t xml:space="preserve">V1.1</w:t>
+              <w:t xml:space="preserve">V0.0.0</w:t>
             </w:r>
           </w:p>
         </w:tc>
@@ -352,7 +352,7 @@
                 <w:sz w:val="20"/>
                 <w:szCs w:val="20"/>
               </w:rPr>
-              <w:t xml:space="preserve">2026-05-22</w:t>
+              <w:t xml:space="preserve">2026-06-17</w:t>
             </w:r>
           </w:p>
         </w:tc>
@@ -416,7 +416,7 @@
                 <w:sz w:val="20"/>
                 <w:szCs w:val="20"/>
               </w:rPr>
-              <w:t xml:space="preserve">V1.1</w:t>
+              <w:t xml:space="preserve">V0.0.0</w:t>
             </w:r>
           </w:p>
         </w:tc>
@@ -647,6 +647,101 @@
                 <w:sz w:val="20"/>
                 <w:szCs w:val="20"/>
               </w:rPr>
+              <w:t xml:space="preserve">V0.0.0</w:t>
+            </w:r>
+          </w:p>
+        </w:tc>
+        <w:tc>
+          <w:tcPr>
+            <w:tcW w:type="dxa" w:w="3024"/>
+            <w:tcBorders>
+              <w:top w:val="single" w:color="CCCCCC" w:sz="1"/>
+              <w:left w:val="single" w:color="CCCCCC" w:sz="1"/>
+              <w:bottom w:val="single" w:color="CCCCCC" w:sz="1"/>
+              <w:right w:val="single" w:color="CCCCCC" w:sz="1"/>
+            </w:tcBorders>
+            <w:tcMar>
+              <w:top w:type="dxa" w:w="60"/>
+              <w:left w:type="dxa" w:w="100"/>
+              <w:bottom w:type="dxa" w:w="60"/>
+              <w:right w:type="dxa" w:w="100"/>
+            </w:tcMar>
+          </w:tcPr>
+          <w:p>
+            <w:pPr>
+              <w:spacing w:line="288"/>
+            </w:pPr>
+            <w:r>
+              <w:rPr>
+                <w:rFonts w:ascii="SimSun" w:cs="SimSun" w:eastAsia="SimSun" w:hAnsi="SimSun"/>
+                <w:color w:val="333333"/>
+                <w:sz w:val="20"/>
+                <w:szCs w:val="20"/>
+              </w:rPr>
+              <w:t xml:space="preserve">2026-06-17</w:t>
+            </w:r>
+          </w:p>
+        </w:tc>
+        <w:tc>
+          <w:tcPr>
+            <w:tcW w:type="dxa" w:w="3024"/>
+            <w:tcBorders>
+              <w:top w:val="single" w:color="CCCCCC" w:sz="1"/>
+              <w:left w:val="single" w:color="CCCCCC" w:sz="1"/>
+              <w:bottom w:val="single" w:color="CCCCCC" w:sz="1"/>
+              <w:right w:val="single" w:color="CCCCCC" w:sz="1"/>
+            </w:tcBorders>
+            <w:tcMar>
+              <w:top w:type="dxa" w:w="60"/>
+              <w:left w:type="dxa" w:w="100"/>
+              <w:bottom w:type="dxa" w:w="60"/>
+              <w:right w:type="dxa" w:w="100"/>
+            </w:tcMar>
+          </w:tcPr>
+          <w:p>
+            <w:pPr>
+              <w:spacing w:line="288"/>
+            </w:pPr>
+            <w:r>
+              <w:rPr>
+                <w:rFonts w:ascii="SimSun" w:cs="SimSun" w:eastAsia="SimSun" w:hAnsi="SimSun"/>
+                <w:color w:val="333333"/>
+                <w:sz w:val="20"/>
+                <w:szCs w:val="20"/>
+              </w:rPr>
+              <w:t xml:space="preserve">版本号重构: 全项目统一为 Vx.y.z (x=0固定, 对应项目名 WPT_PWM_V0.0), 历史 V1.0→V0.0.0, V1.1→V0.0.1</w:t>
+            </w:r>
+          </w:p>
+        </w:tc>
+      </w:tr>
+      <w:tr>
+        <w:tc>
+          <w:tcPr>
+            <w:tcW w:type="dxa" w:w="3024"/>
+            <w:tcBorders>
+              <w:top w:val="single" w:color="CCCCCC" w:sz="1"/>
+              <w:left w:val="single" w:color="CCCCCC" w:sz="1"/>
+              <w:bottom w:val="single" w:color="CCCCCC" w:sz="1"/>
+              <w:right w:val="single" w:color="CCCCCC" w:sz="1"/>
+            </w:tcBorders>
+            <w:tcMar>
+              <w:top w:type="dxa" w:w="60"/>
+              <w:left w:type="dxa" w:w="100"/>
+              <w:bottom w:type="dxa" w:w="60"/>
+              <w:right w:type="dxa" w:w="100"/>
+            </w:tcMar>
+          </w:tcPr>
+          <w:p>
+            <w:pPr>
+              <w:spacing w:line="288"/>
+            </w:pPr>
+            <w:r>
+              <w:rPr>
+                <w:rFonts w:ascii="SimSun" w:cs="SimSun" w:eastAsia="SimSun" w:hAnsi="SimSun"/>
+                <w:color w:val="333333"/>
+                <w:sz w:val="20"/>
+                <w:szCs w:val="20"/>
+              </w:rPr>
               <w:t xml:space="preserve">V1.0</w:t>
             </w:r>
           </w:p>
@@ -855,7 +950,7 @@
           <w:sz w:val="20"/>
           <w:szCs w:val="20"/>
         </w:rPr>
-        <w:t xml:space="preserve">**文档版本**: V1.1</w:t>
+        <w:t xml:space="preserve">**文档版本**: V0.0.0</w:t>
       </w:r>
     </w:p>
     <w:p>

</xml_diff>